<commit_message>
Preenche o formulario da atividade e exporta em PDF
Preenchido com python-docx (docx.Document): desenvolvedor, principais
desafios e solucoes, descricao das duas funcionalidades extras, e as 8
screenshots capturadas no emulador Pixel 7 API 36 (tela inicial, soma,
divisao por zero, virgula, extra %, extra x², troca de sinal e o icone do
app na gaveta de aplicativos).

A secao "Considerações finais - como foi o uso da IA generativa" foi
deixada como placeholder, a ser escrita pelo proprio estudante.

Exportado para PDF via LibreOffice headless (soffice --convert-to pdf).

Co-Authored-By: Claude Sonnet 5 <noreply@anthropic.com>
Claude-Session: https://claude.ai/code/session_0119ckvn6wesFppnFMM3afww
</commit_message>
<xml_diff>
--- a/docs/Form_App1_Calculadora.docx
+++ b/docs/Form_App1_Calculadora.docx
@@ -243,6 +243,14 @@
         </w:rPr>
         <w:t xml:space="preserve"> </w:t>
       </w:r>
+      <w:r>
+        <w:rPr>
+          <w:rFonts w:ascii="Courier New" w:hAnsi="Courier New"/>
+          <w:b w:val="0"/>
+          <w:sz w:val="22"/>
+        </w:rPr>
+        <w:t>André Victor Xavier Pires</w:t>
+      </w:r>
     </w:p>
     <w:p>
       <w:pPr>
@@ -326,6 +334,14 @@
           <w:rFonts w:ascii="Courier New" w:hAnsi="Courier New" w:cs="Courier New"/>
         </w:rPr>
       </w:pPr>
+      <w:r>
+        <w:rPr>
+          <w:rFonts w:ascii="Courier New" w:hAnsi="Courier New"/>
+          <w:b w:val="0"/>
+          <w:sz w:val="22"/>
+        </w:rPr>
+        <w:t>O maior desafio foi entender e completar a máquina de estados que controla o visor (variável “estado”: esperando número, digitando, esperando o segundo número) e reaproveitá-la para as operações novas sem quebrar o fluxo já existente. A divisão por zero foi tratada checando y==0 antes de dividir, mostrando um Toast de aviso e chamando resetAC(). A calculadora brasileira usa vírgula, mas o Java só entende ponto decimal, então criei dois métodos auxiliares que convertem strVisor de um formato para o outro nas duas pontas (leitura e exibição). Outro ponto foi impedir bugs como duas vírgulas no mesmo número (String.contains) e um “07” ao digitar 0 antes de outro dígito. Por fim, ajustei o layout em ConstraintLayout para usar uma chain vertical (além das chains horizontais dadas em aula), distribuindo os botões por toda a altura da tela do Pixel 7 sem deixar espaço vazio embaixo do botão de igual.</w:t>
+      </w:r>
     </w:p>
     <w:p>
       <w:pPr>
@@ -394,6 +410,14 @@
           <w:rFonts w:ascii="Courier New" w:hAnsi="Courier New" w:cs="Courier New"/>
         </w:rPr>
       </w:pPr>
+      <w:r>
+        <w:rPr>
+          <w:rFonts w:ascii="Courier New" w:hAnsi="Courier New"/>
+          <w:b w:val="0"/>
+          <w:sz w:val="22"/>
+        </w:rPr>
+        <w:t>Porcentagem (%) – operação binária, mesma lógica das outras quatro (entra no switch(op) do onClickIgual). Calcula “Y por cento de X”: res = x * y / 100. Exemplo: 200 % 15 = 30 (15% de 200). Útil para contas do dia a dia como descontos, juros e acréscimos.</w:t>
+      </w:r>
     </w:p>
     <w:p>
       <w:pPr>
@@ -462,6 +486,14 @@
           <w:rFonts w:ascii="Courier New" w:hAnsi="Courier New" w:cs="Courier New"/>
         </w:rPr>
       </w:pPr>
+      <w:r>
+        <w:rPr>
+          <w:rFonts w:ascii="Courier New" w:hAnsi="Courier New"/>
+          <w:b w:val="0"/>
+          <w:sz w:val="22"/>
+        </w:rPr>
+        <w:t>Quadrado (x²) – operação unária, aplicada direto sobre o valor do visor, sem precisar do botão “=”. Ao contrário das operações binárias, ela não mexe em x nem em op, então uma conta pendente continua valendo: 3 + 4 x² = resulta em 19 (o quadrado de 4 é somado ao 3 que estava guardado). Útil para cálculos rápidos de área, potência e estatística.</w:t>
+      </w:r>
     </w:p>
     <w:p>
       <w:pPr>
@@ -546,6 +578,14 @@
           <w:rFonts w:ascii="Courier New" w:hAnsi="Courier New" w:cs="Courier New"/>
         </w:rPr>
       </w:pPr>
+      <w:r>
+        <w:rPr>
+          <w:rFonts w:ascii="Courier New" w:hAnsi="Courier New"/>
+          <w:b w:val="0"/>
+          <w:sz w:val="22"/>
+        </w:rPr>
+        <w:t>[ESCREVER AQUI, com suas próprias palavras: como foi usar o Claude Code durante o projeto – planejamento das etapas, o que foi implementado com ajuda da IA, o que você revisou/entendeu no código gerado, e o que aprendeu no processo.]</w:t>
+      </w:r>
     </w:p>
     <w:p>
       <w:pPr>
@@ -697,6 +737,382 @@
         <w:t xml:space="preserve"> </w:t>
       </w:r>
     </w:p>
+    <w:p>
+      <w:r>
+        <w:rPr>
+          <w:rFonts w:ascii="Courier New" w:hAnsi="Courier New"/>
+          <w:b/>
+          <w:sz w:val="20"/>
+        </w:rPr>
+        <w:t>Tela inicial (AC / reset)</w:t>
+      </w:r>
+    </w:p>
+    <w:p>
+      <w:r>
+        <w:drawing>
+          <wp:inline xmlns:a="http://schemas.openxmlformats.org/drawingml/2006/main" xmlns:pic="http://schemas.openxmlformats.org/drawingml/2006/picture">
+            <wp:extent cx="2103120" cy="4673600"/>
+            <wp:docPr id="155748299" name="Picture 155748299"/>
+            <wp:cNvGraphicFramePr>
+              <a:graphicFrameLocks noChangeAspect="1"/>
+            </wp:cNvGraphicFramePr>
+            <a:graphic>
+              <a:graphicData uri="http://schemas.openxmlformats.org/drawingml/2006/picture">
+                <pic:pic>
+                  <pic:nvPicPr>
+                    <pic:cNvPr id="0" name="tela_01_inicial.png"/>
+                    <pic:cNvPicPr/>
+                  </pic:nvPicPr>
+                  <pic:blipFill>
+                    <a:blip r:embed="rId11"/>
+                    <a:stretch>
+                      <a:fillRect/>
+                    </a:stretch>
+                  </pic:blipFill>
+                  <pic:spPr>
+                    <a:xfrm>
+                      <a:off x="0" y="0"/>
+                      <a:ext cx="2103120" cy="4673600"/>
+                    </a:xfrm>
+                    <a:prstGeom prst="rect"/>
+                  </pic:spPr>
+                </pic:pic>
+              </a:graphicData>
+            </a:graphic>
+          </wp:inline>
+        </w:drawing>
+      </w:r>
+    </w:p>
+    <w:p/>
+    <w:p>
+      <w:r>
+        <w:rPr>
+          <w:rFonts w:ascii="Courier New" w:hAnsi="Courier New"/>
+          <w:b/>
+          <w:sz w:val="20"/>
+        </w:rPr>
+        <w:t>Soma: 7 + 3 = 10</w:t>
+      </w:r>
+    </w:p>
+    <w:p>
+      <w:r>
+        <w:drawing>
+          <wp:inline xmlns:a="http://schemas.openxmlformats.org/drawingml/2006/main" xmlns:pic="http://schemas.openxmlformats.org/drawingml/2006/picture">
+            <wp:extent cx="2103120" cy="4673600"/>
+            <wp:docPr id="155748300" name="Picture 155748300"/>
+            <wp:cNvGraphicFramePr>
+              <a:graphicFrameLocks noChangeAspect="1"/>
+            </wp:cNvGraphicFramePr>
+            <a:graphic>
+              <a:graphicData uri="http://schemas.openxmlformats.org/drawingml/2006/picture">
+                <pic:pic>
+                  <pic:nvPicPr>
+                    <pic:cNvPr id="0" name="tela_02_soma.png"/>
+                    <pic:cNvPicPr/>
+                  </pic:nvPicPr>
+                  <pic:blipFill>
+                    <a:blip r:embed="rId12"/>
+                    <a:stretch>
+                      <a:fillRect/>
+                    </a:stretch>
+                  </pic:blipFill>
+                  <pic:spPr>
+                    <a:xfrm>
+                      <a:off x="0" y="0"/>
+                      <a:ext cx="2103120" cy="4673600"/>
+                    </a:xfrm>
+                    <a:prstGeom prst="rect"/>
+                  </pic:spPr>
+                </pic:pic>
+              </a:graphicData>
+            </a:graphic>
+          </wp:inline>
+        </w:drawing>
+      </w:r>
+    </w:p>
+    <w:p/>
+    <w:p>
+      <w:r>
+        <w:rPr>
+          <w:rFonts w:ascii="Courier New" w:hAnsi="Courier New"/>
+          <w:b/>
+          <w:sz w:val="20"/>
+        </w:rPr>
+        <w:t>Divisão por zero tratada (Toast de erro)</w:t>
+      </w:r>
+    </w:p>
+    <w:p>
+      <w:r>
+        <w:drawing>
+          <wp:inline xmlns:a="http://schemas.openxmlformats.org/drawingml/2006/main" xmlns:pic="http://schemas.openxmlformats.org/drawingml/2006/picture">
+            <wp:extent cx="2103120" cy="4673600"/>
+            <wp:docPr id="155748301" name="Picture 155748301"/>
+            <wp:cNvGraphicFramePr>
+              <a:graphicFrameLocks noChangeAspect="1"/>
+            </wp:cNvGraphicFramePr>
+            <a:graphic>
+              <a:graphicData uri="http://schemas.openxmlformats.org/drawingml/2006/picture">
+                <pic:pic>
+                  <pic:nvPicPr>
+                    <pic:cNvPr id="0" name="tela_03_divisao_zero.png"/>
+                    <pic:cNvPicPr/>
+                  </pic:nvPicPr>
+                  <pic:blipFill>
+                    <a:blip r:embed="rId13"/>
+                    <a:stretch>
+                      <a:fillRect/>
+                    </a:stretch>
+                  </pic:blipFill>
+                  <pic:spPr>
+                    <a:xfrm>
+                      <a:off x="0" y="0"/>
+                      <a:ext cx="2103120" cy="4673600"/>
+                    </a:xfrm>
+                    <a:prstGeom prst="rect"/>
+                  </pic:spPr>
+                </pic:pic>
+              </a:graphicData>
+            </a:graphic>
+          </wp:inline>
+        </w:drawing>
+      </w:r>
+    </w:p>
+    <w:p/>
+    <w:p>
+      <w:r>
+        <w:rPr>
+          <w:rFonts w:ascii="Courier New" w:hAnsi="Courier New"/>
+          <w:b/>
+          <w:sz w:val="20"/>
+        </w:rPr>
+        <w:t>Ponto flutuante com vírgula: 3,5</w:t>
+      </w:r>
+    </w:p>
+    <w:p>
+      <w:r>
+        <w:drawing>
+          <wp:inline xmlns:a="http://schemas.openxmlformats.org/drawingml/2006/main" xmlns:pic="http://schemas.openxmlformats.org/drawingml/2006/picture">
+            <wp:extent cx="2103120" cy="4673600"/>
+            <wp:docPr id="155748302" name="Picture 155748302"/>
+            <wp:cNvGraphicFramePr>
+              <a:graphicFrameLocks noChangeAspect="1"/>
+            </wp:cNvGraphicFramePr>
+            <a:graphic>
+              <a:graphicData uri="http://schemas.openxmlformats.org/drawingml/2006/picture">
+                <pic:pic>
+                  <pic:nvPicPr>
+                    <pic:cNvPr id="0" name="tela_04_virgula.png"/>
+                    <pic:cNvPicPr/>
+                  </pic:nvPicPr>
+                  <pic:blipFill>
+                    <a:blip r:embed="rId14"/>
+                    <a:stretch>
+                      <a:fillRect/>
+                    </a:stretch>
+                  </pic:blipFill>
+                  <pic:spPr>
+                    <a:xfrm>
+                      <a:off x="0" y="0"/>
+                      <a:ext cx="2103120" cy="4673600"/>
+                    </a:xfrm>
+                    <a:prstGeom prst="rect"/>
+                  </pic:spPr>
+                </pic:pic>
+              </a:graphicData>
+            </a:graphic>
+          </wp:inline>
+        </w:drawing>
+      </w:r>
+    </w:p>
+    <w:p/>
+    <w:p>
+      <w:r>
+        <w:rPr>
+          <w:rFonts w:ascii="Courier New" w:hAnsi="Courier New"/>
+          <w:b/>
+          <w:sz w:val="20"/>
+        </w:rPr>
+        <w:t>Extra 1 – Porcentagem: 200 % 15 = 30</w:t>
+      </w:r>
+    </w:p>
+    <w:p>
+      <w:r>
+        <w:drawing>
+          <wp:inline xmlns:a="http://schemas.openxmlformats.org/drawingml/2006/main" xmlns:pic="http://schemas.openxmlformats.org/drawingml/2006/picture">
+            <wp:extent cx="2103120" cy="4673600"/>
+            <wp:docPr id="155748303" name="Picture 155748303"/>
+            <wp:cNvGraphicFramePr>
+              <a:graphicFrameLocks noChangeAspect="1"/>
+            </wp:cNvGraphicFramePr>
+            <a:graphic>
+              <a:graphicData uri="http://schemas.openxmlformats.org/drawingml/2006/picture">
+                <pic:pic>
+                  <pic:nvPicPr>
+                    <pic:cNvPr id="0" name="tela_05_extra_porcento.png"/>
+                    <pic:cNvPicPr/>
+                  </pic:nvPicPr>
+                  <pic:blipFill>
+                    <a:blip r:embed="rId15"/>
+                    <a:stretch>
+                      <a:fillRect/>
+                    </a:stretch>
+                  </pic:blipFill>
+                  <pic:spPr>
+                    <a:xfrm>
+                      <a:off x="0" y="0"/>
+                      <a:ext cx="2103120" cy="4673600"/>
+                    </a:xfrm>
+                    <a:prstGeom prst="rect"/>
+                  </pic:spPr>
+                </pic:pic>
+              </a:graphicData>
+            </a:graphic>
+          </wp:inline>
+        </w:drawing>
+      </w:r>
+    </w:p>
+    <w:p/>
+    <w:p>
+      <w:r>
+        <w:rPr>
+          <w:rFonts w:ascii="Courier New" w:hAnsi="Courier New"/>
+          <w:b/>
+          <w:sz w:val="20"/>
+        </w:rPr>
+        <w:t>Extra 2 – Quadrado: 4 x² = 16</w:t>
+      </w:r>
+    </w:p>
+    <w:p>
+      <w:r>
+        <w:drawing>
+          <wp:inline xmlns:a="http://schemas.openxmlformats.org/drawingml/2006/main" xmlns:pic="http://schemas.openxmlformats.org/drawingml/2006/picture">
+            <wp:extent cx="2103120" cy="4673600"/>
+            <wp:docPr id="155748304" name="Picture 155748304"/>
+            <wp:cNvGraphicFramePr>
+              <a:graphicFrameLocks noChangeAspect="1"/>
+            </wp:cNvGraphicFramePr>
+            <a:graphic>
+              <a:graphicData uri="http://schemas.openxmlformats.org/drawingml/2006/picture">
+                <pic:pic>
+                  <pic:nvPicPr>
+                    <pic:cNvPr id="0" name="tela_06_extra_quadrado.png"/>
+                    <pic:cNvPicPr/>
+                  </pic:nvPicPr>
+                  <pic:blipFill>
+                    <a:blip r:embed="rId16"/>
+                    <a:stretch>
+                      <a:fillRect/>
+                    </a:stretch>
+                  </pic:blipFill>
+                  <pic:spPr>
+                    <a:xfrm>
+                      <a:off x="0" y="0"/>
+                      <a:ext cx="2103120" cy="4673600"/>
+                    </a:xfrm>
+                    <a:prstGeom prst="rect"/>
+                  </pic:spPr>
+                </pic:pic>
+              </a:graphicData>
+            </a:graphic>
+          </wp:inline>
+        </w:drawing>
+      </w:r>
+    </w:p>
+    <w:p/>
+    <w:p>
+      <w:r>
+        <w:rPr>
+          <w:rFonts w:ascii="Courier New" w:hAnsi="Courier New"/>
+          <w:b/>
+          <w:sz w:val="20"/>
+        </w:rPr>
+        <w:t>Troca de sinal (+/-): 7 → -7</w:t>
+      </w:r>
+    </w:p>
+    <w:p>
+      <w:r>
+        <w:drawing>
+          <wp:inline xmlns:a="http://schemas.openxmlformats.org/drawingml/2006/main" xmlns:pic="http://schemas.openxmlformats.org/drawingml/2006/picture">
+            <wp:extent cx="2103120" cy="4673600"/>
+            <wp:docPr id="155748305" name="Picture 155748305"/>
+            <wp:cNvGraphicFramePr>
+              <a:graphicFrameLocks noChangeAspect="1"/>
+            </wp:cNvGraphicFramePr>
+            <a:graphic>
+              <a:graphicData uri="http://schemas.openxmlformats.org/drawingml/2006/picture">
+                <pic:pic>
+                  <pic:nvPicPr>
+                    <pic:cNvPr id="0" name="tela_07_sinal.png"/>
+                    <pic:cNvPicPr/>
+                  </pic:nvPicPr>
+                  <pic:blipFill>
+                    <a:blip r:embed="rId17"/>
+                    <a:stretch>
+                      <a:fillRect/>
+                    </a:stretch>
+                  </pic:blipFill>
+                  <pic:spPr>
+                    <a:xfrm>
+                      <a:off x="0" y="0"/>
+                      <a:ext cx="2103120" cy="4673600"/>
+                    </a:xfrm>
+                    <a:prstGeom prst="rect"/>
+                  </pic:spPr>
+                </pic:pic>
+              </a:graphicData>
+            </a:graphic>
+          </wp:inline>
+        </w:drawing>
+      </w:r>
+    </w:p>
+    <w:p/>
+    <w:p>
+      <w:r>
+        <w:rPr>
+          <w:rFonts w:ascii="Courier New" w:hAnsi="Courier New"/>
+          <w:b/>
+          <w:sz w:val="20"/>
+        </w:rPr>
+        <w:t>Ícone do app na gaveta de aplicativos (Calc 26)</w:t>
+      </w:r>
+    </w:p>
+    <w:p>
+      <w:r>
+        <w:drawing>
+          <wp:inline xmlns:a="http://schemas.openxmlformats.org/drawingml/2006/main" xmlns:pic="http://schemas.openxmlformats.org/drawingml/2006/picture">
+            <wp:extent cx="2103120" cy="4673600"/>
+            <wp:docPr id="155748306" name="Picture 155748306"/>
+            <wp:cNvGraphicFramePr>
+              <a:graphicFrameLocks noChangeAspect="1"/>
+            </wp:cNvGraphicFramePr>
+            <a:graphic>
+              <a:graphicData uri="http://schemas.openxmlformats.org/drawingml/2006/picture">
+                <pic:pic>
+                  <pic:nvPicPr>
+                    <pic:cNvPr id="0" name="tela_08_icone.png"/>
+                    <pic:cNvPicPr/>
+                  </pic:nvPicPr>
+                  <pic:blipFill>
+                    <a:blip r:embed="rId18"/>
+                    <a:stretch>
+                      <a:fillRect/>
+                    </a:stretch>
+                  </pic:blipFill>
+                  <pic:spPr>
+                    <a:xfrm>
+                      <a:off x="0" y="0"/>
+                      <a:ext cx="2103120" cy="4673600"/>
+                    </a:xfrm>
+                    <a:prstGeom prst="rect"/>
+                  </pic:spPr>
+                </pic:pic>
+              </a:graphicData>
+            </a:graphic>
+          </wp:inline>
+        </w:drawing>
+      </w:r>
+    </w:p>
+    <w:p/>
     <w:sectPr>
       <w:pgSz w:w="11907" w:h="16840" w:code="9"/>
       <w:pgMar w:top="284" w:right="1134" w:bottom="709" w:left="1276" w:header="720" w:footer="720" w:gutter="0"/>

</xml_diff>